<commit_message>
Rebuild Materi_Buku_Teks_IPAS_E_Module_Kelas4_5_6.docx matching exact official chapter titles (Kelas 4 Bab 4, Kelas 5 Bab 3, Kelas 6 Bab 6)
</commit_message>
<xml_diff>
--- a/science/Materi_Buku_Teks_IPAS_E_Module_Kelas4_5_6.docx
+++ b/science/Materi_Buku_Teks_IPAS_E_Module_Kelas4_5_6.docx
@@ -25,9 +25,9 @@
               <w:rPr>
                 <w:b/>
                 <w:color w:val="FFFFFF"/>
-                <w:sz w:val="30"/>
+                <w:sz w:val="28"/>
               </w:rPr>
-              <w:t>MATERI RESMI BUKU TEKS IPAS (E-MODULE)</w:t>
+              <w:t>MATERI RESMI BUKU TEKS IPAS (E-MODULE KEMENDIKBUDRISTEK)</w:t>
               <w:br/>
             </w:r>
             <w:r>
@@ -35,9 +35,9 @@
                 <w:color w:val="CBD5E1"/>
                 <w:sz w:val="19"/>
               </w:rPr>
-              <w:t>Kutipan Kalimat Baku, Definisi, Kosakata Baru &amp; Konsep Inti Kurikulum Merdeka Kemendikbudristek</w:t>
+              <w:t>Penyesuaian Bab Resmi &amp; Kalimat Baku Buku Teks Kurikulum Merdeka</w:t>
               <w:br/>
-              <w:t>Untuk Sesi Multigrade On-site &amp; Online • PKBM Penerus Bangsa</w:t>
+              <w:t>Untuk Sesi Homeschooling Multigrade (On-site &amp; Online) • PKBM Penerus Bangsa</w:t>
             </w:r>
           </w:p>
         </w:tc>
@@ -69,7 +69,7 @@
                 <w:color w:val="FFFFFF"/>
                 <w:sz w:val="26"/>
               </w:rPr>
-              <w:t>📘 KELAS 4: BUKU SISWA IPAS KELAS IV (EDISI REVISI)</w:t>
+              <w:t>📘 KELAS 4: BAB 4 — MENGUBAH BENTUK ENERGI</w:t>
               <w:br/>
             </w:r>
             <w:r>
@@ -77,9 +77,116 @@
                 <w:color w:val="E2E8F0"/>
                 <w:sz w:val="19"/>
               </w:rPr>
-              <w:t>Bab 1: Mengubah Bentuk Energi &amp; Bab 2: Gaya di Sekitar Kita</w:t>
+              <w:t>Sumber: Buku Guru IPAS Kelas IV (Halaman 103-125) &amp; Buku Siswa IPAS Kelas IV</w:t>
               <w:br/>
-              <w:t>Murid: Hasyif, Alisya, Kinanti (On-site) | Aqlan (Online)</w:t>
+              <w:t>Murid On-site: Hasyif, Alisya, Kinanti | Murid Online: Aqlan</w:t>
+            </w:r>
+          </w:p>
+        </w:tc>
+      </w:tr>
+    </w:tbl>
+    <w:p/>
+    <w:tbl>
+      <w:tblPr>
+        <w:tblW w:type="auto" w:w="0"/>
+        <w:jc w:val="center"/>
+        <w:tblLook w:firstColumn="1" w:firstRow="1" w:lastColumn="0" w:lastRow="0" w:noHBand="0" w:noVBand="1" w:val="04A0"/>
+      </w:tblPr>
+      <w:tblGrid>
+        <w:gridCol w:w="10200"/>
+      </w:tblGrid>
+      <w:tr>
+        <w:tc>
+          <w:tcPr>
+            <w:tcW w:type="dxa" w:w="10200"/>
+            <w:shd w:val="clear" w:color="auto" w:fill="F0FDF4"/>
+            <w:tcBorders>
+              <w:top w:val="single" w:sz="8" w:space="0" w:color="10B981"/>
+              <w:left w:val="single" w:sz="8" w:space="0" w:color="10B981"/>
+              <w:bottom w:val="single" w:sz="8" w:space="0" w:color="10B981"/>
+              <w:right w:val="single" w:sz="8" w:space="0" w:color="10B981"/>
+            </w:tcBorders>
+          </w:tcPr>
+          <w:p>
+            <w:r>
+              <w:rPr>
+                <w:b/>
+                <w:color w:val="065F46"/>
+                <w:sz w:val="22"/>
+              </w:rPr>
+              <w:t>🎯 Tujuan Pembelajaran &amp; Pertanyaan Esensial Bab 4</w:t>
+              <w:br/>
+            </w:r>
+            <w:r>
+              <w:rPr>
+                <w:color w:val="1E293B"/>
+                <w:sz w:val="19"/>
+              </w:rPr>
+              <w:t>• Capaian &amp; Tujuan Pembelajaran Resmi:</w:t>
+              <w:br/>
+            </w:r>
+            <w:r>
+              <w:rPr>
+                <w:color w:val="1E293B"/>
+                <w:sz w:val="19"/>
+              </w:rPr>
+              <w:t xml:space="preserve">  1. Mengidentifikasi ragam transformasi energi pada kehidupan sehari-hari.</w:t>
+              <w:br/>
+            </w:r>
+            <w:r>
+              <w:rPr>
+                <w:color w:val="1E293B"/>
+                <w:sz w:val="19"/>
+              </w:rPr>
+              <w:t xml:space="preserve">  2. Memahami pembagian tipe energi: Energi Potensial (tersimpan) dan Energi Kinetik (bergerak).</w:t>
+              <w:br/>
+            </w:r>
+            <w:r>
+              <w:rPr>
+                <w:color w:val="1E293B"/>
+                <w:sz w:val="19"/>
+              </w:rPr>
+              <w:t xml:space="preserve">  3. Membuat simulasi transformasi energi menggunakan bagan atau alat bantu sederhana.</w:t>
+              <w:br/>
+            </w:r>
+            <w:r>
+              <w:rPr>
+                <w:color w:val="1E293B"/>
+                <w:sz w:val="19"/>
+              </w:rPr>
+              <w:br/>
+            </w:r>
+            <w:r>
+              <w:rPr>
+                <w:color w:val="1E293B"/>
+                <w:sz w:val="19"/>
+              </w:rPr>
+              <w:t>• Pertanyaan Esensial Buku Teks:</w:t>
+              <w:br/>
+            </w:r>
+            <w:r>
+              <w:rPr>
+                <w:color w:val="1E293B"/>
+                <w:sz w:val="19"/>
+              </w:rPr>
+              <w:t xml:space="preserve">  - Bagaimana energi dapat bertransformasi (berubah bentuk)?</w:t>
+              <w:br/>
+            </w:r>
+            <w:r>
+              <w:rPr>
+                <w:color w:val="1E293B"/>
+                <w:sz w:val="19"/>
+              </w:rPr>
+              <w:t xml:space="preserve">  - Mengapa manusia tidak bisa menciptakan energi, melainkan hanya mengubah bentuknya?</w:t>
+              <w:br/>
+            </w:r>
+            <w:r>
+              <w:rPr>
+                <w:color w:val="1E293B"/>
+                <w:sz w:val="19"/>
+              </w:rPr>
+              <w:t xml:space="preserve">  - Apa yang terjadi jika suatu benda berada di tempat tinggi atau dilepaskan di lintasan meluncur?</w:t>
+              <w:br/>
             </w:r>
           </w:p>
         </w:tc>
@@ -101,10 +208,10 @@
             <w:tcW w:type="dxa" w:w="10200"/>
             <w:shd w:val="clear" w:color="auto" w:fill="ECFDF5"/>
             <w:tcBorders>
-              <w:top w:val="single" w:sz="8" w:space="0" w:color="10B981"/>
-              <w:left w:val="single" w:sz="8" w:space="0" w:color="10B981"/>
-              <w:bottom w:val="single" w:sz="8" w:space="0" w:color="10B981"/>
-              <w:right w:val="single" w:sz="8" w:space="0" w:color="10B981"/>
+              <w:top w:val="single" w:sz="8" w:space="0" w:color="059669"/>
+              <w:left w:val="single" w:sz="8" w:space="0" w:color="059669"/>
+              <w:bottom w:val="single" w:sz="8" w:space="0" w:color="059669"/>
+              <w:right w:val="single" w:sz="8" w:space="0" w:color="059669"/>
             </w:tcBorders>
           </w:tcPr>
           <w:p>
@@ -114,7 +221,7 @@
                 <w:color w:val="065F46"/>
                 <w:sz w:val="22"/>
               </w:rPr>
-              <w:t>📌 A. Bab 1 Topik A &amp; C: Mengubah Bentuk Energi (Kutipan Resmi Halaman 3-7 &amp; 15-19)</w:t>
+              <w:t>📖 Rincian Topik Resmi &amp; Kutipan Kalimat Baku Buku Teks</w:t>
               <w:br/>
             </w:r>
             <w:r>
@@ -122,7 +229,7 @@
                 <w:color w:val="1E293B"/>
                 <w:sz w:val="19"/>
               </w:rPr>
-              <w:t>• Prinsip Dasar Energi:</w:t>
+              <w:t>1. Topik A: Transformasi Energi di Sekitar Kita</w:t>
               <w:br/>
             </w:r>
             <w:r>
@@ -130,7 +237,15 @@
                 <w:color w:val="1E293B"/>
                 <w:sz w:val="19"/>
               </w:rPr>
-              <w:t xml:space="preserve">  "Tahukah kamu, kalau ternyata manusia tidak bisa menciptakan energi. Untuk memanfaatkan energi, manusia mengubah bentuk energi yang ada menjadi bentuk energi yang lain."</w:t>
+              <w:t xml:space="preserve">   "Energi itu kekal, artinya tidak bisa diciptakan dan tidak bisa juga dimusnahkan. Untuk memanfaatkan energi, manusia mengubah bentuk energi yang ada menjadi bentuk energi yang lain."</w:t>
+              <w:br/>
+            </w:r>
+            <w:r>
+              <w:rPr>
+                <w:color w:val="1E293B"/>
+                <w:sz w:val="19"/>
+              </w:rPr>
+              <w:t xml:space="preserve">   "Umumnya alat-alat buatan manusia adalah alat untuk mengubah bentuk energi guna memudahkan kehidupan serta menyelesaikan masalah yang dihadapi manusia."</w:t>
               <w:br/>
             </w:r>
             <w:r>
@@ -145,7 +260,7 @@
                 <w:color w:val="1E293B"/>
                 <w:sz w:val="19"/>
               </w:rPr>
-              <w:t>• Fungsi Alat Buatan Manusia:</w:t>
+              <w:t>2. Topik B: Energi yang Tersimpan (Energi Potensial)</w:t>
               <w:br/>
             </w:r>
             <w:r>
@@ -153,7 +268,7 @@
                 <w:color w:val="1E293B"/>
                 <w:sz w:val="19"/>
               </w:rPr>
-              <w:t xml:space="preserve">  "Umumnya alat-alat buatan manusia adalah alat untuk mengubah bentuk energi. Alat tersebut dibuat untuk memudahkan dan memenuhi kebutuhan manusia, serta menyelesaikan masalah yang dihadapi manusia."</w:t>
+              <w:t xml:space="preserve">   "Energi potensial adalah energi yang tersimpan pada suatu benda. Makanan yang kita makan menyimpan energi kimia. Benda yang berada di tempat tinggi menyimpan energi potensial gravitasi. Makin tinggi posisi benda, makin besar energi potensialnya."</w:t>
               <w:br/>
             </w:r>
             <w:r>
@@ -168,7 +283,7 @@
                 <w:color w:val="1E293B"/>
                 <w:sz w:val="19"/>
               </w:rPr>
-              <w:t>• Transformasi dalam Tubuh Manusia:</w:t>
+              <w:t>3. Topik C: Energi yang Bergerak (Energi Kinetik) &amp; Energi Ikutan</w:t>
               <w:br/>
             </w:r>
             <w:r>
@@ -176,7 +291,15 @@
                 <w:color w:val="1E293B"/>
                 <w:sz w:val="19"/>
               </w:rPr>
-              <w:t xml:space="preserve">  "Manusia membutuhkan makanan dan air sebagai sumber energi. Energi kimia dari makanan diubah menjadi energi gerak sehingga kita dapat melakukan banyak aktivitas."</w:t>
+              <w:t xml:space="preserve">   "Energi gerak disebut juga energi kinetik. Saat benda meluncur ke bawah, seluruh energi potensial berubah menjadi energi gerak."</w:t>
+              <w:br/>
+            </w:r>
+            <w:r>
+              <w:rPr>
+                <w:color w:val="1E293B"/>
+                <w:sz w:val="19"/>
+              </w:rPr>
+              <w:t xml:space="preserve">   "Namun pada kenyataannya, tidak semua energi sepenuhnya bisa kita ubah menjadi energi yang kita inginkan. Sebagian energi akan berubah menjadi energi panas akibat gaya gesek."</w:t>
               <w:br/>
             </w:r>
             <w:r>
@@ -191,7 +314,7 @@
                 <w:color w:val="1E293B"/>
                 <w:sz w:val="19"/>
               </w:rPr>
-              <w:t>• Energi Ikutan (Disipasi Panas):</w:t>
+              <w:t>• Kosakata Baru Resmi Buku Teks:</w:t>
               <w:br/>
             </w:r>
             <w:r>
@@ -199,7 +322,31 @@
                 <w:color w:val="1E293B"/>
                 <w:sz w:val="19"/>
               </w:rPr>
-              <w:t xml:space="preserve">  "Namun, tidak semua energi bisa sepenuhnya kita ubah menjadi energi yang kita inginkan. Sebagian energi akan berubah bentuk menjadi energi panas dan energi kimia lagi dalam bentuk asap/buangan."</w:t>
+              <w:t xml:space="preserve">  - Kekal: Abadi, tidak dapat diciptakan dari nol dan tidak dapat dimusnahkan.</w:t>
+              <w:br/>
+            </w:r>
+            <w:r>
+              <w:rPr>
+                <w:color w:val="1E293B"/>
+                <w:sz w:val="19"/>
+              </w:rPr>
+              <w:t xml:space="preserve">  - Transformasi: Perubahan bentuk wujud energi dari satu jenis ke jenis lainnya.</w:t>
+              <w:br/>
+            </w:r>
+            <w:r>
+              <w:rPr>
+                <w:color w:val="1E293B"/>
+                <w:sz w:val="19"/>
+              </w:rPr>
+              <w:t xml:space="preserve">  - Energi Potensial: Energi yang tersimpan pada benda karena posisi/ketinggiannya.</w:t>
+              <w:br/>
+            </w:r>
+            <w:r>
+              <w:rPr>
+                <w:color w:val="1E293B"/>
+                <w:sz w:val="19"/>
+              </w:rPr>
+              <w:t xml:space="preserve">  - Energi Kinetik: Energi yang dimiliki oleh benda yang bergerak.</w:t>
               <w:br/>
             </w:r>
             <w:r>
@@ -214,7 +361,7 @@
                 <w:color w:val="1E293B"/>
                 <w:sz w:val="19"/>
               </w:rPr>
-              <w:t>• Kosakata Baru Buku Teks:</w:t>
+              <w:t>• Integrasi Game Kontekstual (Skater Ramp):</w:t>
               <w:br/>
             </w:r>
             <w:r>
@@ -222,151 +369,7 @@
                 <w:color w:val="1E293B"/>
                 <w:sz w:val="19"/>
               </w:rPr>
-              <w:t xml:space="preserve">  - Listrik Statis: Listrik yang tidak bergerak dan tidak mengalir melalui kawat, biasanya terjadi akibat gesekan benda berbahan plastik dengan rambut.</w:t>
-              <w:br/>
-            </w:r>
-          </w:p>
-        </w:tc>
-      </w:tr>
-    </w:tbl>
-    <w:p/>
-    <w:tbl>
-      <w:tblPr>
-        <w:tblW w:type="auto" w:w="0"/>
-        <w:jc w:val="center"/>
-        <w:tblLook w:firstColumn="1" w:firstRow="1" w:lastColumn="0" w:lastRow="0" w:noHBand="0" w:noVBand="1" w:val="04A0"/>
-      </w:tblPr>
-      <w:tblGrid>
-        <w:gridCol w:w="10200"/>
-      </w:tblGrid>
-      <w:tr>
-        <w:tc>
-          <w:tcPr>
-            <w:tcW w:type="dxa" w:w="10200"/>
-            <w:shd w:val="clear" w:color="auto" w:fill="F0FDF4"/>
-            <w:tcBorders>
-              <w:top w:val="single" w:sz="8" w:space="0" w:color="059669"/>
-              <w:left w:val="single" w:sz="8" w:space="0" w:color="059669"/>
-              <w:bottom w:val="single" w:sz="8" w:space="0" w:color="059669"/>
-              <w:right w:val="single" w:sz="8" w:space="0" w:color="059669"/>
-            </w:tcBorders>
-          </w:tcPr>
-          <w:p>
-            <w:r>
-              <w:rPr>
-                <w:b/>
-                <w:color w:val="065F46"/>
-                <w:sz w:val="22"/>
-              </w:rPr>
-              <w:t>📌 B. Bab 2 Topik A &amp; B: Gaya di Sekitar Kita (Kutipan Resmi Halaman 27-38)</w:t>
-              <w:br/>
-            </w:r>
-            <w:r>
-              <w:rPr>
-                <w:color w:val="1E293B"/>
-                <w:sz w:val="19"/>
-              </w:rPr>
-              <w:t>• Definisi Gaya:</w:t>
-              <w:br/>
-            </w:r>
-            <w:r>
-              <w:rPr>
-                <w:color w:val="1E293B"/>
-                <w:sz w:val="19"/>
-              </w:rPr>
-              <w:t xml:space="preserve">  "Gaya adalah interaksi pada benda dalam bentuk tarikan atau dorongan. Interaksi dapat menggerakkan benda bebas. Akibatnya, benda diam bisa menjadi bergerak. Menarik dan mendorong membuat benda bergerak."</w:t>
-              <w:br/>
-            </w:r>
-            <w:r>
-              <w:rPr>
-                <w:color w:val="1E293B"/>
-                <w:sz w:val="19"/>
-              </w:rPr>
-              <w:br/>
-            </w:r>
-            <w:r>
-              <w:rPr>
-                <w:color w:val="1E293B"/>
-                <w:sz w:val="19"/>
-              </w:rPr>
-              <w:t>• Gaya Otot:</w:t>
-              <w:br/>
-            </w:r>
-            <w:r>
-              <w:rPr>
-                <w:color w:val="1E293B"/>
-                <w:sz w:val="19"/>
-              </w:rPr>
-              <w:t xml:space="preserve">  "Gaya otot adalah gaya yang dikeluarkan dari manusia atau hewan menggunakan otot pada tubuh mereka."</w:t>
-              <w:br/>
-            </w:r>
-            <w:r>
-              <w:rPr>
-                <w:color w:val="1E293B"/>
-                <w:sz w:val="19"/>
-              </w:rPr>
-              <w:br/>
-            </w:r>
-            <w:r>
-              <w:rPr>
-                <w:color w:val="1E293B"/>
-                <w:sz w:val="19"/>
-              </w:rPr>
-              <w:t>• Gaya Gesek:</w:t>
-              <w:br/>
-            </w:r>
-            <w:r>
-              <w:rPr>
-                <w:color w:val="1E293B"/>
-                <w:sz w:val="19"/>
-              </w:rPr>
-              <w:t xml:space="preserve">  "Saat benda diberikan gaya dorong atau tarik, maka akan terjadi gesekan antara benda dan permukaan lantai. Hal ini menyebabkan terjadinya gaya gesek. Gaya gesek adalah gaya yang terjadi saat dua benda saling bergesekan."</w:t>
-              <w:br/>
-            </w:r>
-            <w:r>
-              <w:rPr>
-                <w:color w:val="1E293B"/>
-                <w:sz w:val="19"/>
-              </w:rPr>
-              <w:br/>
-            </w:r>
-            <w:r>
-              <w:rPr>
-                <w:color w:val="1E293B"/>
-                <w:sz w:val="19"/>
-              </w:rPr>
-              <w:t>• Karakteristik Permukaan &amp; Gaya Gesek:</w:t>
-              <w:br/>
-            </w:r>
-            <w:r>
-              <w:rPr>
-                <w:color w:val="1E293B"/>
-                <w:sz w:val="19"/>
-              </w:rPr>
-              <w:t xml:space="preserve">  "Permukaan yang kasar menghasilkan gaya gesek yang besar (menghambat gerak dan menimbulkan panas). Permukaan yang halus menghasilkan gaya gesek yang kecil (benda lebih mudah meluncur)."</w:t>
-              <w:br/>
-            </w:r>
-            <w:r>
-              <w:rPr>
-                <w:color w:val="1E293B"/>
-                <w:sz w:val="19"/>
-              </w:rPr>
-              <w:br/>
-            </w:r>
-            <w:r>
-              <w:rPr>
-                <w:color w:val="1E293B"/>
-                <w:sz w:val="19"/>
-              </w:rPr>
-              <w:t>• Diferensiasi Khusus Alisya (Disleksia/Sensori):</w:t>
-              <w:br/>
-            </w:r>
-            <w:r>
-              <w:rPr>
-                <w:color w:val="1E293B"/>
-                <w:sz w:val="19"/>
-              </w:rPr>
-              <w:t xml:space="preserve">  Penyajian teks konkret dengan kartu simbol visual (Gaya Otot = Dorong/Tarik, Gaya Gesek = Rem/Kasar, Gravitasi = Jatuh ke Bawah, Magnet = Tarik Logam).</w:t>
+              <w:t xml:space="preserve">  Hasyif, Alisya, Kinanti, dan Aqlan membuktikan bahwa meluncur dari ketinggian 6m menghasilkan energi potensial maksimal yang berubah menjadi kinetik 35 km/jam, dan gesekan aspal kasar mengubah energi gerak 100% menjadi energi panas di roda saat ngerem di depan kucing.</w:t>
               <w:br/>
             </w:r>
           </w:p>
@@ -404,7 +407,7 @@
                 <w:color w:val="FFFFFF"/>
                 <w:sz w:val="26"/>
               </w:rPr>
-              <w:t>⚡ KELAS 5: BUKU SISWA IPAS KELAS V</w:t>
+              <w:t>⚡ KELAS 5: BAB 3 — MAGNET, LISTRIK, DAN TEKNOLOGI UNTUK KEHIDUPAN</w:t>
               <w:br/>
             </w:r>
             <w:r>
@@ -412,9 +415,9 @@
                 <w:color w:val="E2E8F0"/>
                 <w:sz w:val="19"/>
               </w:rPr>
-              <w:t>Bab 3: Magnet, Listrik, dan Teknologi untuk Kehidupan</w:t>
+              <w:t>Sumber: Buku Siswa IPAS Kelas V (Halaman 79-106)</w:t>
               <w:br/>
-              <w:t>Murid: Ardiansyah (On-site) | Mishka (Online)</w:t>
+              <w:t>Murid On-site: Ardiansyah | Murid Online: Mishka</w:t>
             </w:r>
           </w:p>
         </w:tc>
@@ -449,7 +452,7 @@
                 <w:color w:val="312E81"/>
                 <w:sz w:val="22"/>
               </w:rPr>
-              <w:t>📌 A. Bab 3 Topik A: Apa dan Untuk Apa Magnet Diciptakan? (Kutipan Resmi Halaman 80-86)</w:t>
+              <w:t>🎯 Tujuan Pembelajaran &amp; Pertanyaan Esensial Bab 3</w:t>
               <w:br/>
             </w:r>
             <w:r>
@@ -457,7 +460,7 @@
                 <w:color w:val="1E293B"/>
                 <w:sz w:val="19"/>
               </w:rPr>
-              <w:t>• Sifat dan Definisi Magnet:</w:t>
+              <w:t>• Capaian &amp; Tujuan Pembelajaran Resmi:</w:t>
               <w:br/>
             </w:r>
             <w:r>
@@ -465,7 +468,23 @@
                 <w:color w:val="1E293B"/>
                 <w:sz w:val="19"/>
               </w:rPr>
-              <w:t xml:space="preserve">  "Magnet adalah suatu logam yang memiliki kemampuan menarik besi lainnya. Tidak semua benda bisa ditarik oleh magnet. Hanya benda-benda yang mengandung logam yang dapat ditarik oleh magnet."</w:t>
+              <w:t xml:space="preserve">  1. Memanfaatkan gaya magnet untuk menjalani aktivitas sehari-hari.</w:t>
+              <w:br/>
+            </w:r>
+            <w:r>
+              <w:rPr>
+                <w:color w:val="1E293B"/>
+                <w:sz w:val="19"/>
+              </w:rPr>
+              <w:t xml:space="preserve">  2. Mendeskripsikan bagaimana energi listrik diperoleh, dialirkan, dan digunakan.</w:t>
+              <w:br/>
+            </w:r>
+            <w:r>
+              <w:rPr>
+                <w:color w:val="1E293B"/>
+                <w:sz w:val="19"/>
+              </w:rPr>
+              <w:t xml:space="preserve">  3. Menggunakan perangkat teknologi yang memanfaatkan perubahan energi listrik dan magnet.</w:t>
               <w:br/>
             </w:r>
             <w:r>
@@ -480,7 +499,7 @@
                 <w:color w:val="1E293B"/>
                 <w:sz w:val="19"/>
               </w:rPr>
-              <w:t>• Medan Magnet &amp; Garis Gaya Magnet:</w:t>
+              <w:t>• Pertanyaan Esensial Buku Teks:</w:t>
               <w:br/>
             </w:r>
             <w:r>
@@ -488,7 +507,7 @@
                 <w:color w:val="1E293B"/>
                 <w:sz w:val="19"/>
               </w:rPr>
-              <w:t xml:space="preserve">  "Garis-garis yang terbentuk menunjukkan medan magnet. Semakin banyak serbuk pasir/besi yang menempel di bagian tertentu maka semakin besar kekuatan magnet di bagian tersebut. Kekuatan magnet yang paling besar terdapat di bagian ujungnya."</w:t>
+              <w:t xml:space="preserve">  - Apa itu magnet dan bagaimana garis medan magnet bekerja?</w:t>
               <w:br/>
             </w:r>
             <w:r>
@@ -496,6 +515,7 @@
                 <w:color w:val="1E293B"/>
                 <w:sz w:val="19"/>
               </w:rPr>
+              <w:t xml:space="preserve">  - Bagaimana cara membuat magnet buatan menggunakan baterai dan kawat tembaga (elektromagnet)?</w:t>
               <w:br/>
             </w:r>
             <w:r>
@@ -503,7 +523,7 @@
                 <w:color w:val="1E293B"/>
                 <w:sz w:val="19"/>
               </w:rPr>
-              <w:t>• Hukum Kutub Magnet:</w:t>
+              <w:t xml:space="preserve">  - Mengapa instalasi rumah dan rumah sakit wajib menggunakan rangkaian paralel, bukan seri?</w:t>
               <w:br/>
             </w:r>
             <w:r>
@@ -511,53 +531,7 @@
                 <w:color w:val="1E293B"/>
                 <w:sz w:val="19"/>
               </w:rPr>
-              <w:t xml:space="preserve">  "Setiap magnet selalu memiliki kutub Utara (N) dan kutub Selatan (S). Apabila dua magnet dengan kutub yang sejenis dipertemukan maka kedua magnet tersebut akan tolak-menolak. Apabila dua magnet dengan kutub yang berbeda jenis dipertemukan maka kedua magnet tersebut akan tarik-menarik."</w:t>
-              <w:br/>
-            </w:r>
-            <w:r>
-              <w:rPr>
-                <w:color w:val="1E293B"/>
-                <w:sz w:val="19"/>
-              </w:rPr>
-              <w:br/>
-            </w:r>
-            <w:r>
-              <w:rPr>
-                <w:color w:val="1E293B"/>
-                <w:sz w:val="19"/>
-              </w:rPr>
-              <w:t>• Cara Membuat Magnet Sendiri (Elektromagnet):</w:t>
-              <w:br/>
-            </w:r>
-            <w:r>
-              <w:rPr>
-                <w:color w:val="1E293B"/>
-                <w:sz w:val="19"/>
-              </w:rPr>
-              <w:t xml:space="preserve">  "Salah satu cara membuat magnet, yaitu dengan menggunakan baterai dan kabel tembaga yang dililitkan ke besi, contohnya paku. Saat kabel dialiri arus listrik, paku berubah menjadi magnet."</w:t>
-              <w:br/>
-            </w:r>
-            <w:r>
-              <w:rPr>
-                <w:color w:val="1E293B"/>
-                <w:sz w:val="19"/>
-              </w:rPr>
-              <w:br/>
-            </w:r>
-            <w:r>
-              <w:rPr>
-                <w:color w:val="1E293B"/>
-                <w:sz w:val="19"/>
-              </w:rPr>
-              <w:t>• Kosakata Baru Buku Teks:</w:t>
-              <w:br/>
-            </w:r>
-            <w:r>
-              <w:rPr>
-                <w:color w:val="1E293B"/>
-                <w:sz w:val="19"/>
-              </w:rPr>
-              <w:t xml:space="preserve">  - Medan Magnet: Lingkungan di sekeliling magnet yang dipengaruhi gaya magnet.</w:t>
+              <w:t xml:space="preserve">  - Bagaimana penerapan magnet dan listrik pada teknologi transportasi canggih (kereta Maglev)?</w:t>
               <w:br/>
             </w:r>
           </w:p>
@@ -593,7 +567,7 @@
                 <w:color w:val="312E81"/>
                 <w:sz w:val="22"/>
               </w:rPr>
-              <w:t>📌 B. Bab 3 Topik B &amp; C: Aliran Listrik &amp; Teknologi (Kutipan Resmi Halaman 87-98)</w:t>
+              <w:t>📖 Rincian Topik Resmi &amp; Kutipan Kalimat Baku Buku Teks</w:t>
               <w:br/>
             </w:r>
             <w:r>
@@ -601,7 +575,7 @@
                 <w:color w:val="1E293B"/>
                 <w:sz w:val="19"/>
               </w:rPr>
-              <w:t>• Hakikat Arus Listrik &amp; Elektron:</w:t>
+              <w:t>1. Topik A: Apa dan Untuk Apa Magnet Diciptakan?</w:t>
               <w:br/>
             </w:r>
             <w:r>
@@ -609,7 +583,23 @@
                 <w:color w:val="1E293B"/>
                 <w:sz w:val="19"/>
               </w:rPr>
-              <w:t xml:space="preserve">  "Energi listrik merupakan energi yang berasal dari pergerakan benda yang sangat kecil yang disebut elektron. Elektron bisa berpindah dari satu tempat ke tempat yang lain dan menciptakan arus listrik."</w:t>
+              <w:t xml:space="preserve">   "Magnet adalah suatu logam yang memiliki kemampuan menarik besi lainnya. Garis-garis yang terbentuk dari serbuk besi menunjukkan medan magnet. Kekuatan magnet yang paling besar terdapat di bagian ujung kutubnya."</w:t>
+              <w:br/>
+            </w:r>
+            <w:r>
+              <w:rPr>
+                <w:color w:val="1E293B"/>
+                <w:sz w:val="19"/>
+              </w:rPr>
+              <w:t xml:space="preserve">   "Setiap magnet memiliki kutub Utara (N) dan Selatan (S). Dua magnet dengan kutub sejenis akan tolak-menolak. Dua magnet dengan kutub berbeda jenis akan tarik-menarik."</w:t>
+              <w:br/>
+            </w:r>
+            <w:r>
+              <w:rPr>
+                <w:color w:val="1E293B"/>
+                <w:sz w:val="19"/>
+              </w:rPr>
+              <w:t xml:space="preserve">   "Salah satu cara membuat magnet, yaitu dengan menggunakan baterai dan kabel yang dililitkan ke besi/paku (elektromagnet)."</w:t>
               <w:br/>
             </w:r>
             <w:r>
@@ -624,7 +614,7 @@
                 <w:color w:val="1E293B"/>
                 <w:sz w:val="19"/>
               </w:rPr>
-              <w:t>• Jenis Arus Listrik:</w:t>
+              <w:t>2. Topik B: Bagaimana Cara Mendapatkan Energi Listrik?</w:t>
               <w:br/>
             </w:r>
             <w:r>
@@ -632,7 +622,23 @@
                 <w:color w:val="1E293B"/>
                 <w:sz w:val="19"/>
               </w:rPr>
-              <w:t xml:space="preserve">  "Arus listrik searah (DC) didapatkan dari baterai. Arus listrik dua arah (AC) didapatkan dari stop kontak PLN yang berasal dari gardu dan pembangkit listrik."</w:t>
+              <w:t xml:space="preserve">   "Energi listrik merupakan energi yang berasal dari pergerakan benda sangat kecil yang disebut elektron. Elektron bisa berpindah menciptakan arus listrik."</w:t>
+              <w:br/>
+            </w:r>
+            <w:r>
+              <w:rPr>
+                <w:color w:val="1E293B"/>
+                <w:sz w:val="19"/>
+              </w:rPr>
+              <w:t xml:space="preserve">   "Pada rangkaian seri, arus hanya mengalir melalui satu jalur tunggal. Jika satu alat dilepas/rusak, seluruh sirkuit padam total."</w:t>
+              <w:br/>
+            </w:r>
+            <w:r>
+              <w:rPr>
+                <w:color w:val="1E293B"/>
+                <w:sz w:val="19"/>
+              </w:rPr>
+              <w:t xml:space="preserve">   "Pada rangkaian paralel, arus mengalir melalui cabang-cabang mandiri. Jika satu alat dicabut, alat lain tetap menyala aman."</w:t>
               <w:br/>
             </w:r>
             <w:r>
@@ -647,7 +653,7 @@
                 <w:color w:val="1E293B"/>
                 <w:sz w:val="19"/>
               </w:rPr>
-              <w:t>• Definisi Teknologi:</w:t>
+              <w:t>3. Topik C: Teknologi untuk Kehidupan</w:t>
               <w:br/>
             </w:r>
             <w:r>
@@ -655,7 +661,15 @@
                 <w:color w:val="1E293B"/>
                 <w:sz w:val="19"/>
               </w:rPr>
-              <w:t xml:space="preserve">  "Teknologi adalah penerapan dari ilmu pengetahuan yang membantu kita menyelesaikan permasalahan dalam kehidupan sehari-hari (Britannica, 2020)."</w:t>
+              <w:t xml:space="preserve">   "Teknologi adalah penerapan dari ilmu pengetahuan yang membantu kita menyelesaikan permasalahan dalam kehidupan sehari-hari (Britannica, 2020)."</w:t>
+              <w:br/>
+            </w:r>
+            <w:r>
+              <w:rPr>
+                <w:color w:val="1E293B"/>
+                <w:sz w:val="19"/>
+              </w:rPr>
+              <w:t xml:space="preserve">   "Penerapan mutakhir: Kereta Maglev memanfaatkan gaya tolak-menolak magnet berkutub sejenis sehingga terangkat melayang 10 cm di atas rel, meniadakan gesekan roda, dan melesat 600 km/jam."</w:t>
               <w:br/>
             </w:r>
             <w:r>
@@ -670,7 +684,7 @@
                 <w:color w:val="1E293B"/>
                 <w:sz w:val="19"/>
               </w:rPr>
-              <w:t>• Aplikasi Listrik &amp; Magnet Modern (Kereta Maglev):</w:t>
+              <w:t>• Kosakata Baru Resmi Buku Teks:</w:t>
               <w:br/>
             </w:r>
             <w:r>
@@ -678,7 +692,23 @@
                 <w:color w:val="1E293B"/>
                 <w:sz w:val="19"/>
               </w:rPr>
-              <w:t xml:space="preserve">  "Pemanfaatan gaya tolak magnet kutub sejenis pada rel dan dasar kereta memungkinkan kereta melayang di atas rel tanpa gesekan roda, menghasilkan laju berkecepatan sangat tinggi."</w:t>
+              <w:t xml:space="preserve">  - Elektron: Partikel berukuran sangat kecil yang bermuatan negatif.</w:t>
+              <w:br/>
+            </w:r>
+            <w:r>
+              <w:rPr>
+                <w:color w:val="1E293B"/>
+                <w:sz w:val="19"/>
+              </w:rPr>
+              <w:t xml:space="preserve">  - Medan Magnet: Lingkungan di sekeliling magnet yang dipengaruhi gaya magnet.</w:t>
+              <w:br/>
+            </w:r>
+            <w:r>
+              <w:rPr>
+                <w:color w:val="1E293B"/>
+                <w:sz w:val="19"/>
+              </w:rPr>
+              <w:t xml:space="preserve">  - Gardu Listrik: Alat penyalur daya dari pembangkit ke bangunan.</w:t>
               <w:br/>
             </w:r>
             <w:r>
@@ -693,7 +723,7 @@
                 <w:color w:val="1E293B"/>
                 <w:sz w:val="19"/>
               </w:rPr>
-              <w:t>• Kosakata Baru Buku Teks:</w:t>
+              <w:t>• Integrasi Game Kontekstual (RS Darurat &amp; Maglev):</w:t>
               <w:br/>
             </w:r>
             <w:r>
@@ -701,23 +731,7 @@
                 <w:color w:val="1E293B"/>
                 <w:sz w:val="19"/>
               </w:rPr>
-              <w:t xml:space="preserve">  - Elektron: Suatu partikel berukuran sangat kecil yang bermuatan negatif.</w:t>
-              <w:br/>
-            </w:r>
-            <w:r>
-              <w:rPr>
-                <w:color w:val="1E293B"/>
-                <w:sz w:val="19"/>
-              </w:rPr>
-              <w:t xml:space="preserve">  - Gardu Listrik: Alat yang digunakan untuk menyalurkan listrik dari pembangkit ke bangunan tertentu.</w:t>
-              <w:br/>
-            </w:r>
-            <w:r>
-              <w:rPr>
-                <w:color w:val="1E293B"/>
-                <w:sz w:val="19"/>
-              </w:rPr>
-              <w:t xml:space="preserve">  - Energi Alternatif: Energi yang berasal dari sumber nonfosil (air, angin, matahari).</w:t>
+              <w:t xml:space="preserve">  Ardiansyah dan Mishka menguji penyelamatan ventilator ICU saat bohlam lampu dicabut pada sirkuit paralel, serta merekayasa lilitan kawat paku untuk mengangkat 25 klip besi daur ulang.</w:t>
               <w:br/>
             </w:r>
           </w:p>
@@ -755,7 +769,7 @@
                 <w:color w:val="FFFFFF"/>
                 <w:sz w:val="26"/>
               </w:rPr>
-              <w:t>🏙️ KELAS 6: BUKU SISWA IPAS KELAS VI</w:t>
+              <w:t>🏙️ KELAS 6: BAB 6 — GAWAT! BENARKAH ENERGI DI BUMI AKAN HABIS?</w:t>
               <w:br/>
             </w:r>
             <w:r>
@@ -763,9 +777,9 @@
                 <w:color w:val="E2E8F0"/>
                 <w:sz w:val="19"/>
               </w:rPr>
-              <w:t>Bab 6: Gawat! Benarkah Energi di Bumi akan Habis?</w:t>
+              <w:t>Sumber: Buku Siswa IPAS Kelas VI (Halaman 143-160)</w:t>
               <w:br/>
-              <w:t>Murid: Shan, Aulya, Hendra, Selvi (On-site)</w:t>
+              <w:t>Murid On-site: Shan, Aulya, Hendra, Selvi</w:t>
             </w:r>
           </w:p>
         </w:tc>
@@ -800,7 +814,7 @@
                 <w:color w:val="0369A1"/>
                 <w:sz w:val="22"/>
               </w:rPr>
-              <w:t>📌 A. Bab 6 Topik A &amp; B: Krisis Energi Fosil (Kutipan Resmi Halaman 144-152)</w:t>
+              <w:t>🎯 Tujuan Pembelajaran &amp; Pertanyaan Esensial Bab 6</w:t>
               <w:br/>
             </w:r>
             <w:r>
@@ -808,7 +822,7 @@
                 <w:color w:val="1E293B"/>
                 <w:sz w:val="19"/>
               </w:rPr>
-              <w:t>• Peran Vital Energi Listrik:</w:t>
+              <w:t>• Capaian &amp; Tujuan Pembelajaran Resmi:</w:t>
               <w:br/>
             </w:r>
             <w:r>
@@ -816,7 +830,23 @@
                 <w:color w:val="1E293B"/>
                 <w:sz w:val="19"/>
               </w:rPr>
-              <w:t xml:space="preserve">  "Ketika tidak ada energi listrik, kita tidak bisa menggunakan perangkat listrik, pemancar sinyal telekomunikasi, rumah sakit, bandar udara, dan pelabuhan. Hampir semua aktivitas manusia akan terhenti."</w:t>
+              <w:t xml:space="preserve">  1. Memahami pentingnya peran energi dalam membantu kita menjalani aktivitas sehari-hari.</w:t>
+              <w:br/>
+            </w:r>
+            <w:r>
+              <w:rPr>
+                <w:color w:val="1E293B"/>
+                <w:sz w:val="19"/>
+              </w:rPr>
+              <w:t xml:space="preserve">  2. Memahami peran energi terbarukan dalam menghadapi keterbatasan energi fosil.</w:t>
+              <w:br/>
+            </w:r>
+            <w:r>
+              <w:rPr>
+                <w:color w:val="1E293B"/>
+                <w:sz w:val="19"/>
+              </w:rPr>
+              <w:t xml:space="preserve">  3. Melakukan upaya-upaya penghematan energi dan audit efisiensi kelistrikan kota.</w:t>
               <w:br/>
             </w:r>
             <w:r>
@@ -831,7 +861,7 @@
                 <w:color w:val="1E293B"/>
                 <w:sz w:val="19"/>
               </w:rPr>
-              <w:t>• Ketergantungan pada Energi Fosil:</w:t>
+              <w:t>• Pertanyaan Esensial Buku Teks:</w:t>
               <w:br/>
             </w:r>
             <w:r>
@@ -839,7 +869,7 @@
                 <w:color w:val="1E293B"/>
                 <w:sz w:val="19"/>
               </w:rPr>
-              <w:t xml:space="preserve">  "Sebanyak 64,5% energi listrik didapatkan dari energi fosil (minyak bumi, batu bara, dan gas alam). Energi fosil digunakan untuk memanaskan air menjadi uap yang memutar turbin generator pembangkit listrik."</w:t>
+              <w:t xml:space="preserve">  - Apa peran energi bagi kehidupan dan apa dampaknya jika listrik padam total (blackout)?</w:t>
               <w:br/>
             </w:r>
             <w:r>
@@ -847,6 +877,7 @@
                 <w:color w:val="1E293B"/>
                 <w:sz w:val="19"/>
               </w:rPr>
+              <w:t xml:space="preserve">  - Mengapa energi fosil (minyak bumi, batu bara, gas alam) tergolong energi yang tidak terbarukan?</w:t>
               <w:br/>
             </w:r>
             <w:r>
@@ -854,101 +885,7 @@
                 <w:color w:val="1E293B"/>
                 <w:sz w:val="19"/>
               </w:rPr>
-              <w:t>• Mengapa Energi Fosil Dapat Habis? (Tidak Terbarukan):</w:t>
-              <w:br/>
-            </w:r>
-            <w:r>
-              <w:rPr>
-                <w:color w:val="1E293B"/>
-                <w:sz w:val="19"/>
-              </w:rPr>
-              <w:t xml:space="preserve">  "Bahan bakar fosil berasal dari tanaman dan hewan yang mati dan tertimbun selama jutaan tahun di dalam kerak bumi. Dibutuhkan waktu jutaan tahun untuk terbentuk kembali sehingga tergolong sumber energi yang tidak dapat terbarukan. Jika terus digunakan, diperkirakan akan terjadi krisis energi."</w:t>
-              <w:br/>
-            </w:r>
-            <w:r>
-              <w:rPr>
-                <w:color w:val="1E293B"/>
-                <w:sz w:val="19"/>
-              </w:rPr>
-              <w:br/>
-            </w:r>
-            <w:r>
-              <w:rPr>
-                <w:color w:val="1E293B"/>
-                <w:sz w:val="19"/>
-              </w:rPr>
-              <w:t>• Ragam Bentuk Energi Baku:</w:t>
-              <w:br/>
-            </w:r>
-            <w:r>
-              <w:rPr>
-                <w:color w:val="1E293B"/>
-                <w:sz w:val="19"/>
-              </w:rPr>
-              <w:t xml:space="preserve">  - Energi Mekanik: Energi yang terlibat dalam suatu proses pergerakan mekanis.</w:t>
-              <w:br/>
-            </w:r>
-            <w:r>
-              <w:rPr>
-                <w:color w:val="1E293B"/>
-                <w:sz w:val="19"/>
-              </w:rPr>
-              <w:t xml:space="preserve">  - Energi Termal: Energi yang berkaitan dengan perpindahan panas dari satu benda ke benda lain.</w:t>
-              <w:br/>
-            </w:r>
-            <w:r>
-              <w:rPr>
-                <w:color w:val="1E293B"/>
-                <w:sz w:val="19"/>
-              </w:rPr>
-              <w:t xml:space="preserve">  - Energi Kimia: Energi yang terlibat dalam reaksi kimia.</w:t>
-              <w:br/>
-            </w:r>
-            <w:r>
-              <w:rPr>
-                <w:color w:val="1E293B"/>
-                <w:sz w:val="19"/>
-              </w:rPr>
-              <w:t xml:space="preserve">  - Energi Nuklir: Energi panas dari reaksi zat kimia nuklir.</w:t>
-              <w:br/>
-            </w:r>
-            <w:r>
-              <w:rPr>
-                <w:color w:val="1E293B"/>
-                <w:sz w:val="19"/>
-              </w:rPr>
-              <w:br/>
-            </w:r>
-            <w:r>
-              <w:rPr>
-                <w:color w:val="1E293B"/>
-                <w:sz w:val="19"/>
-              </w:rPr>
-              <w:t>• Kosakata Baru Buku Teks:</w:t>
-              <w:br/>
-            </w:r>
-            <w:r>
-              <w:rPr>
-                <w:color w:val="1E293B"/>
-                <w:sz w:val="19"/>
-              </w:rPr>
-              <w:t xml:space="preserve">  - Termal: Suatu kondisi berdasarkan suhu dan udara.</w:t>
-              <w:br/>
-            </w:r>
-            <w:r>
-              <w:rPr>
-                <w:color w:val="1E293B"/>
-                <w:sz w:val="19"/>
-              </w:rPr>
-              <w:t xml:space="preserve">  - Kalor: Panas.</w:t>
-              <w:br/>
-            </w:r>
-            <w:r>
-              <w:rPr>
-                <w:color w:val="1E293B"/>
-                <w:sz w:val="19"/>
-              </w:rPr>
-              <w:t xml:space="preserve">  - Krisis: Keadaan yang berbahaya.</w:t>
+              <w:t xml:space="preserve">  - Apa saja sumber energi terbarukan di Indonesia dan bagaimana teknologi cerdas memanfaatkannya?</w:t>
               <w:br/>
             </w:r>
           </w:p>
@@ -984,7 +921,7 @@
                 <w:color w:val="0369A1"/>
                 <w:sz w:val="22"/>
               </w:rPr>
-              <w:t>📌 B. Bab 6 Topik C: Energi Terbarukan &amp; Efisiensi Energi (Kutipan Resmi Halaman 152-160)</w:t>
+              <w:t>📖 Rincian Topik Resmi &amp; Kutipan Kalimat Baku Buku Teks</w:t>
               <w:br/>
             </w:r>
             <w:r>
@@ -992,7 +929,7 @@
                 <w:color w:val="1E293B"/>
                 <w:sz w:val="19"/>
               </w:rPr>
-              <w:t>• Definisi Energi Terbarukan:</w:t>
+              <w:t>1. Topik A: Apa Jadinya Jika Tidak Ada Energi?</w:t>
               <w:br/>
             </w:r>
             <w:r>
@@ -1000,7 +937,15 @@
                 <w:color w:val="1E293B"/>
                 <w:sz w:val="19"/>
               </w:rPr>
-              <w:t xml:space="preserve">  "Energi terbarukan adalah energi yang digunakan sebagai pengganti energi fosil yang berasal dari alam dan tidak akan habis. Penggunaannya ramah lingkungan dan tidak mencemari udara."</w:t>
+              <w:t xml:space="preserve">   "Ketika tidak ada energi listrik, hampir semua aktivitas manusia terhenti. Sebanyak 64,5% energi listrik yang kita peroleh didapatkan dari energi fosil (minyak bumi, batu bara, dan gas alam)."</w:t>
+              <w:br/>
+            </w:r>
+            <w:r>
+              <w:rPr>
+                <w:color w:val="1E293B"/>
+                <w:sz w:val="19"/>
+              </w:rPr>
+              <w:t xml:space="preserve">   "Energi tidak dapat dihilangkan atau dimusnahkan, melainkan dapat mengalami perubahan bentuk. Bentuk-bentuk energi: Energi Mekanik, Energi Termal (Kalor), Energi Kimia, dan Energi Nuklir."</w:t>
               <w:br/>
             </w:r>
             <w:r>
@@ -1015,7 +960,7 @@
                 <w:color w:val="1E293B"/>
                 <w:sz w:val="19"/>
               </w:rPr>
-              <w:t>• Macam-Macam Sumber Energi Terbarukan di Indonesia:</w:t>
+              <w:t>2. Topik B: Benarkah Energi akan Habis?</w:t>
               <w:br/>
             </w:r>
             <w:r>
@@ -1023,39 +968,7 @@
                 <w:color w:val="1E293B"/>
                 <w:sz w:val="19"/>
               </w:rPr>
-              <w:t xml:space="preserve">  1. Sinar Matahari: Merupakan sumber energi cahaya terbesar di dunia dan dapat dijadikan sumber listrik dengan bantuan alat panel surya (photovoltaic).</w:t>
-              <w:br/>
-            </w:r>
-            <w:r>
-              <w:rPr>
-                <w:color w:val="1E293B"/>
-                <w:sz w:val="19"/>
-              </w:rPr>
-              <w:t xml:space="preserve">  2. Air (PLTA): Memasangkan kincir/turbin pada air yang berarus deras sehingga memutar generator penghasil arus listrik.</w:t>
-              <w:br/>
-            </w:r>
-            <w:r>
-              <w:rPr>
-                <w:color w:val="1E293B"/>
-                <w:sz w:val="19"/>
-              </w:rPr>
-              <w:t xml:space="preserve">  3. Angin/Bayu (PLTB): Memanfaatkan energi kinetik tiupan angin untuk memutar kincir dan generator (seperti di PLTB Bantul dan PLTB Sidrap, Sulawesi).</w:t>
-              <w:br/>
-            </w:r>
-            <w:r>
-              <w:rPr>
-                <w:color w:val="1E293B"/>
-                <w:sz w:val="19"/>
-              </w:rPr>
-              <w:t xml:space="preserve">  4. Biogas &amp; Biodiesel: Energi dari limbah organik kotoran dan tanaman sebagai pengganti gas elpiji dan minyak bumi.</w:t>
-              <w:br/>
-            </w:r>
-            <w:r>
-              <w:rPr>
-                <w:color w:val="1E293B"/>
-                <w:sz w:val="19"/>
-              </w:rPr>
-              <w:t xml:space="preserve">  5. Panas Bumi (Geotermal): Uap panas dari sumur dalam bumi dialirkan melalui pipa untuk menggerakkan turbin generator pengganti batu bara di PLTU.</w:t>
+              <w:t xml:space="preserve">   "Bahan bakar fosil berasal dari tanaman dan hewan yang telah mati dan tertimbun selama jutaan tahun di dalam kerak Bumi. Butuh waktu sangat lama untuk terbentuk kembali sehingga tergolong sumber energi yang tidak dapat terbarukan. Penggunaan berlebihan dapat memicu krisis energi."</w:t>
               <w:br/>
             </w:r>
             <w:r>
@@ -1070,7 +983,7 @@
                 <w:color w:val="1E293B"/>
                 <w:sz w:val="19"/>
               </w:rPr>
-              <w:t>• Upaya Penghematan &amp; Smart Efficiency:</w:t>
+              <w:t>3. Topik C: Energi Terbarukan &amp; Efisiensi Energi</w:t>
               <w:br/>
             </w:r>
             <w:r>
@@ -1078,7 +991,23 @@
                 <w:color w:val="1E293B"/>
                 <w:sz w:val="19"/>
               </w:rPr>
-              <w:t xml:space="preserve">  "Untuk menghindari krisis energi, manusia wajib menghemat energi dan beralih ke peralatan berefisiensi tinggi (seperti beralih dari lampu pijar ke LED) serta mengembangkan transmisi listrik cerdas."</w:t>
+              <w:t xml:space="preserve">   "Energi terbarukan adalah energi pengganti energi fosil yang berasal dari alam dan tidak akan habis, ramah lingkungan, serta tidak menghasilkan gas rumah kaca."</w:t>
+              <w:br/>
+            </w:r>
+            <w:r>
+              <w:rPr>
+                <w:color w:val="1E293B"/>
+                <w:sz w:val="19"/>
+              </w:rPr>
+              <w:t xml:space="preserve">   "Potensi terbarukan Indonesia: Sinar Matahari (panel surya photovoltaic), Air (PLTA), Angin/Bayu (PLTB Sidrap &amp; Bantul), Biogas &amp; Biodiesel, dan Panas Bumi (Geotermal)."</w:t>
+              <w:br/>
+            </w:r>
+            <w:r>
+              <w:rPr>
+                <w:color w:val="1E293B"/>
+                <w:sz w:val="19"/>
+              </w:rPr>
+              <w:t xml:space="preserve">   "Upaya Penghematan: Beralih ke lampu berefisiensi tinggi (lampu Eco-LED menghemat 83,3% daya dibanding lampu pijar 60W) serta memasang Smart Grid berarsitektur paralel agar badai petir tidak memadamkan rumah sakit."</w:t>
               <w:br/>
             </w:r>
             <w:r>
@@ -1093,7 +1022,7 @@
                 <w:color w:val="1E293B"/>
                 <w:sz w:val="19"/>
               </w:rPr>
-              <w:t>• Kosakata Baru Buku Teks:</w:t>
+              <w:t>• Kosakata Baru Resmi Buku Teks:</w:t>
               <w:br/>
             </w:r>
             <w:r>
@@ -1101,7 +1030,31 @@
                 <w:color w:val="1E293B"/>
                 <w:sz w:val="19"/>
               </w:rPr>
-              <w:t xml:space="preserve">  - Terbarukan: Dapat diperbarui.</w:t>
+              <w:t xml:space="preserve">  - Termal: Suatu kondisi berdasarkan suhu dan udara.</w:t>
+              <w:br/>
+            </w:r>
+            <w:r>
+              <w:rPr>
+                <w:color w:val="1E293B"/>
+                <w:sz w:val="19"/>
+              </w:rPr>
+              <w:t xml:space="preserve">  - Kalor: Panas.</w:t>
+              <w:br/>
+            </w:r>
+            <w:r>
+              <w:rPr>
+                <w:color w:val="1E293B"/>
+                <w:sz w:val="19"/>
+              </w:rPr>
+              <w:t xml:space="preserve">  - Terbarukan: Dapat diperbarui secara alami dan tidak akan pernah habis.</w:t>
+              <w:br/>
+            </w:r>
+            <w:r>
+              <w:rPr>
+                <w:color w:val="1E293B"/>
+                <w:sz w:val="19"/>
+              </w:rPr>
+              <w:t xml:space="preserve">  - Krisis: Keadaan yang berbahaya (kelangkaan energi).</w:t>
               <w:br/>
             </w:r>
             <w:r>
@@ -1110,6 +1063,29 @@
                 <w:sz w:val="19"/>
               </w:rPr>
               <w:t xml:space="preserve">  - Limbah: Bahan sisa proses produksi.</w:t>
+              <w:br/>
+            </w:r>
+            <w:r>
+              <w:rPr>
+                <w:color w:val="1E293B"/>
+                <w:sz w:val="19"/>
+              </w:rPr>
+              <w:br/>
+            </w:r>
+            <w:r>
+              <w:rPr>
+                <w:color w:val="1E293B"/>
+                <w:sz w:val="19"/>
+              </w:rPr>
+              <w:t>• Integrasi Game Kontekstual (Smart City):</w:t>
+              <w:br/>
+            </w:r>
+            <w:r>
+              <w:rPr>
+                <w:color w:val="1E293B"/>
+                <w:sz w:val="19"/>
+              </w:rPr>
+              <w:t xml:space="preserve">  Shan, Aulya, Hendra, dan Selvi membuktikan bahwa jika kecepatan angin 0 km/jam dan sinar matahari 0%, kota mengalami blackout (0 kWh), mengaudit penghematan 50.000 Watt lampu jalan kota, dan membangun sistem transmisi paralel anti-mati lampu.</w:t>
               <w:br/>
             </w:r>
           </w:p>

</xml_diff>